<commit_message>
added analysis outputs, appendix materials, and reproducibility documentation
</commit_message>
<xml_diff>
--- a/03_report/tables/descriptive_statistics_coordination.docx
+++ b/03_report/tables/descriptive_statistics_coordination.docx
@@ -19,9 +19,7 @@
       </w:tblPr>
       <w:tr>
         <w:trPr>
-          <w:cantSplit/>
           <w:trHeight w:val="464" w:hRule="auto"/>
-          <w:tblHeader/>
         </w:trPr>
         <w:tc>
           <w:tcPr>
@@ -58,8 +56,8 @@
                 <w:b w:val="true"/>
                 <w:u w:val="none"/>
                 <w:strike w:val="false"/>
-                <w:sz w:val="18"/>
-                <w:szCs w:val="18"/>
+                <w:sz w:val="22"/>
+                <w:szCs w:val="22"/>
                 <w:color w:val="000000"/>
               </w:rPr>
             </w:pPr>
@@ -70,8 +68,8 @@
                 <w:b w:val="true"/>
                 <w:u w:val="none"/>
                 <w:strike w:val="false"/>
-                <w:sz w:val="18"/>
-                <w:szCs w:val="18"/>
+                <w:sz w:val="22"/>
+                <w:szCs w:val="22"/>
                 <w:color w:val="000000"/>
               </w:rPr>
               <w:t xml:space="preserve">Condition</w:t>
@@ -113,8 +111,8 @@
                 <w:b w:val="true"/>
                 <w:u w:val="none"/>
                 <w:strike w:val="false"/>
-                <w:sz w:val="18"/>
-                <w:szCs w:val="18"/>
+                <w:sz w:val="22"/>
+                <w:szCs w:val="22"/>
                 <w:color w:val="000000"/>
               </w:rPr>
             </w:pPr>
@@ -125,8 +123,8 @@
                 <w:b w:val="true"/>
                 <w:u w:val="none"/>
                 <w:strike w:val="false"/>
-                <w:sz w:val="18"/>
-                <w:szCs w:val="18"/>
+                <w:sz w:val="22"/>
+                <w:szCs w:val="22"/>
                 <w:color w:val="000000"/>
               </w:rPr>
               <w:t xml:space="preserve">Baseline</w:t>
@@ -168,8 +166,8 @@
                 <w:b w:val="true"/>
                 <w:u w:val="none"/>
                 <w:strike w:val="false"/>
-                <w:sz w:val="18"/>
-                <w:szCs w:val="18"/>
+                <w:sz w:val="22"/>
+                <w:szCs w:val="22"/>
                 <w:color w:val="000000"/>
               </w:rPr>
             </w:pPr>
@@ -180,8 +178,8 @@
                 <w:b w:val="true"/>
                 <w:u w:val="none"/>
                 <w:strike w:val="false"/>
-                <w:sz w:val="18"/>
-                <w:szCs w:val="18"/>
+                <w:sz w:val="22"/>
+                <w:szCs w:val="22"/>
                 <w:color w:val="000000"/>
               </w:rPr>
               <w:t xml:space="preserve">Low</w:t>
@@ -223,8 +221,8 @@
                 <w:b w:val="true"/>
                 <w:u w:val="none"/>
                 <w:strike w:val="false"/>
-                <w:sz w:val="18"/>
-                <w:szCs w:val="18"/>
+                <w:sz w:val="22"/>
+                <w:szCs w:val="22"/>
                 <w:color w:val="000000"/>
               </w:rPr>
             </w:pPr>
@@ -235,8 +233,8 @@
                 <w:b w:val="true"/>
                 <w:u w:val="none"/>
                 <w:strike w:val="false"/>
-                <w:sz w:val="18"/>
-                <w:szCs w:val="18"/>
+                <w:sz w:val="22"/>
+                <w:szCs w:val="22"/>
                 <w:color w:val="000000"/>
               </w:rPr>
               <w:t xml:space="preserve">Moderate</w:t>
@@ -278,8 +276,8 @@
                 <w:b w:val="true"/>
                 <w:u w:val="none"/>
                 <w:strike w:val="false"/>
-                <w:sz w:val="18"/>
-                <w:szCs w:val="18"/>
+                <w:sz w:val="22"/>
+                <w:szCs w:val="22"/>
                 <w:color w:val="000000"/>
               </w:rPr>
             </w:pPr>
@@ -290,8 +288,8 @@
                 <w:b w:val="true"/>
                 <w:u w:val="none"/>
                 <w:strike w:val="false"/>
-                <w:sz w:val="18"/>
-                <w:szCs w:val="18"/>
+                <w:sz w:val="22"/>
+                <w:szCs w:val="22"/>
                 <w:color w:val="000000"/>
               </w:rPr>
               <w:t xml:space="preserve">High</w:t>
@@ -301,9 +299,7 @@
       </w:tr>
       <w:tr>
         <w:trPr>
-          <w:cantSplit/>
           <w:trHeight w:val="464" w:hRule="auto"/>
-          <w:tblHeader/>
         </w:trPr>
         <w:tc>
           <w:tcPr>
@@ -340,8 +336,8 @@
                 <w:b w:val="true"/>
                 <w:u w:val="none"/>
                 <w:strike w:val="false"/>
-                <w:sz w:val="18"/>
-                <w:szCs w:val="18"/>
+                <w:sz w:val="22"/>
+                <w:szCs w:val="22"/>
                 <w:color w:val="000000"/>
               </w:rPr>
             </w:pPr>
@@ -352,8 +348,8 @@
                 <w:b w:val="true"/>
                 <w:u w:val="none"/>
                 <w:strike w:val="false"/>
-                <w:sz w:val="18"/>
-                <w:szCs w:val="18"/>
+                <w:sz w:val="22"/>
+                <w:szCs w:val="22"/>
                 <w:color w:val="000000"/>
               </w:rPr>
               <w:t xml:space="preserve">Statistic</w:t>
@@ -395,8 +391,8 @@
                 <w:b w:val="true"/>
                 <w:u w:val="none"/>
                 <w:strike w:val="false"/>
-                <w:sz w:val="18"/>
-                <w:szCs w:val="18"/>
+                <w:sz w:val="22"/>
+                <w:szCs w:val="22"/>
                 <w:color w:val="000000"/>
               </w:rPr>
             </w:pPr>
@@ -407,8 +403,8 @@
                 <w:b w:val="true"/>
                 <w:u w:val="none"/>
                 <w:strike w:val="false"/>
-                <w:sz w:val="18"/>
-                <w:szCs w:val="18"/>
+                <w:sz w:val="22"/>
+                <w:szCs w:val="22"/>
                 <w:color w:val="000000"/>
               </w:rPr>
               <w:t xml:space="preserve">Mean (SD)</w:t>
@@ -450,8 +446,8 @@
                 <w:b w:val="true"/>
                 <w:u w:val="none"/>
                 <w:strike w:val="false"/>
-                <w:sz w:val="18"/>
-                <w:szCs w:val="18"/>
+                <w:sz w:val="22"/>
+                <w:szCs w:val="22"/>
                 <w:color w:val="000000"/>
               </w:rPr>
             </w:pPr>
@@ -462,8 +458,8 @@
                 <w:b w:val="true"/>
                 <w:u w:val="none"/>
                 <w:strike w:val="false"/>
-                <w:sz w:val="18"/>
-                <w:szCs w:val="18"/>
+                <w:sz w:val="22"/>
+                <w:szCs w:val="22"/>
                 <w:color w:val="000000"/>
               </w:rPr>
               <w:t xml:space="preserve">Mean (SD)</w:t>
@@ -505,8 +501,8 @@
                 <w:b w:val="true"/>
                 <w:u w:val="none"/>
                 <w:strike w:val="false"/>
-                <w:sz w:val="18"/>
-                <w:szCs w:val="18"/>
+                <w:sz w:val="22"/>
+                <w:szCs w:val="22"/>
                 <w:color w:val="000000"/>
               </w:rPr>
             </w:pPr>
@@ -517,8 +513,8 @@
                 <w:b w:val="true"/>
                 <w:u w:val="none"/>
                 <w:strike w:val="false"/>
-                <w:sz w:val="18"/>
-                <w:szCs w:val="18"/>
+                <w:sz w:val="22"/>
+                <w:szCs w:val="22"/>
                 <w:color w:val="000000"/>
               </w:rPr>
               <w:t xml:space="preserve">Mean (SD)</w:t>
@@ -560,8 +556,8 @@
                 <w:b w:val="true"/>
                 <w:u w:val="none"/>
                 <w:strike w:val="false"/>
-                <w:sz w:val="18"/>
-                <w:szCs w:val="18"/>
+                <w:sz w:val="22"/>
+                <w:szCs w:val="22"/>
                 <w:color w:val="000000"/>
               </w:rPr>
             </w:pPr>
@@ -572,8 +568,8 @@
                 <w:b w:val="true"/>
                 <w:u w:val="none"/>
                 <w:strike w:val="false"/>
-                <w:sz w:val="18"/>
-                <w:szCs w:val="18"/>
+                <w:sz w:val="22"/>
+                <w:szCs w:val="22"/>
                 <w:color w:val="000000"/>
               </w:rPr>
               <w:t xml:space="preserve">Mean (SD)</w:t>
@@ -583,7 +579,6 @@
       </w:tr>
       <w:tr>
         <w:trPr>
-          <w:cantSplit/>
           <w:trHeight w:val="360" w:hRule="auto"/>
         </w:trPr>
         <w:tc>
@@ -621,8 +616,8 @@
                 <w:b w:val="true"/>
                 <w:u w:val="none"/>
                 <w:strike w:val="false"/>
-                <w:sz w:val="18"/>
-                <w:szCs w:val="18"/>
+                <w:sz w:val="22"/>
+                <w:szCs w:val="22"/>
                 <w:color w:val="000000"/>
               </w:rPr>
             </w:pPr>
@@ -633,8 +628,8 @@
                 <w:b w:val="true"/>
                 <w:u w:val="none"/>
                 <w:strike w:val="false"/>
-                <w:sz w:val="18"/>
-                <w:szCs w:val="18"/>
+                <w:sz w:val="22"/>
+                <w:szCs w:val="22"/>
                 <w:color w:val="000000"/>
               </w:rPr>
               <w:t xml:space="preserve">Interaction rounds</w:t>
@@ -676,8 +671,8 @@
                 <w:b w:val="false"/>
                 <w:u w:val="none"/>
                 <w:strike w:val="false"/>
-                <w:sz w:val="18"/>
-                <w:szCs w:val="18"/>
+                <w:sz w:val="22"/>
+                <w:szCs w:val="22"/>
                 <w:color w:val="000000"/>
               </w:rPr>
             </w:pPr>
@@ -688,8 +683,8 @@
                 <w:b w:val="false"/>
                 <w:u w:val="none"/>
                 <w:strike w:val="false"/>
-                <w:sz w:val="18"/>
-                <w:szCs w:val="18"/>
+                <w:sz w:val="22"/>
+                <w:szCs w:val="22"/>
                 <w:color w:val="000000"/>
               </w:rPr>
               <w:t xml:space="preserve">2.41</w:t>
@@ -701,8 +696,8 @@
                 <w:b w:val="false"/>
                 <w:u w:val="none"/>
                 <w:strike w:val="false"/>
-                <w:sz w:val="18"/>
-                <w:szCs w:val="18"/>
+                <w:sz w:val="22"/>
+                <w:szCs w:val="22"/>
                 <w:color w:val="000000"/>
               </w:rPr>
               <w:br/>
@@ -714,8 +709,8 @@
                 <w:b w:val="false"/>
                 <w:u w:val="none"/>
                 <w:strike w:val="false"/>
-                <w:sz w:val="18"/>
-                <w:szCs w:val="18"/>
+                <w:sz w:val="22"/>
+                <w:szCs w:val="22"/>
                 <w:color w:val="000000"/>
               </w:rPr>
               <w:t xml:space="preserve">(0.77)</w:t>
@@ -757,8 +752,8 @@
                 <w:b w:val="false"/>
                 <w:u w:val="none"/>
                 <w:strike w:val="false"/>
-                <w:sz w:val="18"/>
-                <w:szCs w:val="18"/>
+                <w:sz w:val="22"/>
+                <w:szCs w:val="22"/>
                 <w:color w:val="000000"/>
               </w:rPr>
             </w:pPr>
@@ -769,8 +764,8 @@
                 <w:b w:val="false"/>
                 <w:u w:val="none"/>
                 <w:strike w:val="false"/>
-                <w:sz w:val="18"/>
-                <w:szCs w:val="18"/>
+                <w:sz w:val="22"/>
+                <w:szCs w:val="22"/>
                 <w:color w:val="000000"/>
               </w:rPr>
               <w:t xml:space="preserve">2.82</w:t>
@@ -782,8 +777,8 @@
                 <w:b w:val="false"/>
                 <w:u w:val="none"/>
                 <w:strike w:val="false"/>
-                <w:sz w:val="18"/>
-                <w:szCs w:val="18"/>
+                <w:sz w:val="22"/>
+                <w:szCs w:val="22"/>
                 <w:color w:val="000000"/>
               </w:rPr>
               <w:br/>
@@ -795,8 +790,8 @@
                 <w:b w:val="false"/>
                 <w:u w:val="none"/>
                 <w:strike w:val="false"/>
-                <w:sz w:val="18"/>
-                <w:szCs w:val="18"/>
+                <w:sz w:val="22"/>
+                <w:szCs w:val="22"/>
                 <w:color w:val="000000"/>
               </w:rPr>
               <w:t xml:space="preserve">(1.03)</w:t>
@@ -838,8 +833,8 @@
                 <w:b w:val="false"/>
                 <w:u w:val="none"/>
                 <w:strike w:val="false"/>
-                <w:sz w:val="18"/>
-                <w:szCs w:val="18"/>
+                <w:sz w:val="22"/>
+                <w:szCs w:val="22"/>
                 <w:color w:val="000000"/>
               </w:rPr>
             </w:pPr>
@@ -850,8 +845,8 @@
                 <w:b w:val="false"/>
                 <w:u w:val="none"/>
                 <w:strike w:val="false"/>
-                <w:sz w:val="18"/>
-                <w:szCs w:val="18"/>
+                <w:sz w:val="22"/>
+                <w:szCs w:val="22"/>
                 <w:color w:val="000000"/>
               </w:rPr>
               <w:t xml:space="preserve">2.46</w:t>
@@ -863,8 +858,8 @@
                 <w:b w:val="false"/>
                 <w:u w:val="none"/>
                 <w:strike w:val="false"/>
-                <w:sz w:val="18"/>
-                <w:szCs w:val="18"/>
+                <w:sz w:val="22"/>
+                <w:szCs w:val="22"/>
                 <w:color w:val="000000"/>
               </w:rPr>
               <w:br/>
@@ -876,8 +871,8 @@
                 <w:b w:val="false"/>
                 <w:u w:val="none"/>
                 <w:strike w:val="false"/>
-                <w:sz w:val="18"/>
-                <w:szCs w:val="18"/>
+                <w:sz w:val="22"/>
+                <w:szCs w:val="22"/>
                 <w:color w:val="000000"/>
               </w:rPr>
               <w:t xml:space="preserve">(0.78)</w:t>
@@ -919,8 +914,8 @@
                 <w:b w:val="false"/>
                 <w:u w:val="none"/>
                 <w:strike w:val="false"/>
-                <w:sz w:val="18"/>
-                <w:szCs w:val="18"/>
+                <w:sz w:val="22"/>
+                <w:szCs w:val="22"/>
                 <w:color w:val="000000"/>
               </w:rPr>
             </w:pPr>
@@ -931,8 +926,8 @@
                 <w:b w:val="false"/>
                 <w:u w:val="none"/>
                 <w:strike w:val="false"/>
-                <w:sz w:val="18"/>
-                <w:szCs w:val="18"/>
+                <w:sz w:val="22"/>
+                <w:szCs w:val="22"/>
                 <w:color w:val="000000"/>
               </w:rPr>
               <w:t xml:space="preserve">2.38</w:t>
@@ -944,8 +939,8 @@
                 <w:b w:val="false"/>
                 <w:u w:val="none"/>
                 <w:strike w:val="false"/>
-                <w:sz w:val="18"/>
-                <w:szCs w:val="18"/>
+                <w:sz w:val="22"/>
+                <w:szCs w:val="22"/>
                 <w:color w:val="000000"/>
               </w:rPr>
               <w:br/>
@@ -957,8 +952,8 @@
                 <w:b w:val="false"/>
                 <w:u w:val="none"/>
                 <w:strike w:val="false"/>
-                <w:sz w:val="18"/>
-                <w:szCs w:val="18"/>
+                <w:sz w:val="22"/>
+                <w:szCs w:val="22"/>
                 <w:color w:val="000000"/>
               </w:rPr>
               <w:t xml:space="preserve">(0.70)</w:t>
@@ -968,7 +963,6 @@
       </w:tr>
       <w:tr>
         <w:trPr>
-          <w:cantSplit/>
           <w:trHeight w:val="360" w:hRule="auto"/>
         </w:trPr>
         <w:tc>
@@ -1006,8 +1000,8 @@
                 <w:b w:val="true"/>
                 <w:u w:val="none"/>
                 <w:strike w:val="false"/>
-                <w:sz w:val="18"/>
-                <w:szCs w:val="18"/>
+                <w:sz w:val="22"/>
+                <w:szCs w:val="22"/>
                 <w:color w:val="000000"/>
               </w:rPr>
             </w:pPr>
@@ -1018,8 +1012,8 @@
                 <w:b w:val="true"/>
                 <w:u w:val="none"/>
                 <w:strike w:val="false"/>
-                <w:sz w:val="18"/>
-                <w:szCs w:val="18"/>
+                <w:sz w:val="22"/>
+                <w:szCs w:val="22"/>
                 <w:color w:val="000000"/>
               </w:rPr>
               <w:t xml:space="preserve">Total public messages</w:t>
@@ -1061,8 +1055,8 @@
                 <w:b w:val="false"/>
                 <w:u w:val="none"/>
                 <w:strike w:val="false"/>
-                <w:sz w:val="18"/>
-                <w:szCs w:val="18"/>
+                <w:sz w:val="22"/>
+                <w:szCs w:val="22"/>
                 <w:color w:val="000000"/>
               </w:rPr>
             </w:pPr>
@@ -1073,8 +1067,8 @@
                 <w:b w:val="false"/>
                 <w:u w:val="none"/>
                 <w:strike w:val="false"/>
-                <w:sz w:val="18"/>
-                <w:szCs w:val="18"/>
+                <w:sz w:val="22"/>
+                <w:szCs w:val="22"/>
                 <w:color w:val="000000"/>
               </w:rPr>
               <w:t xml:space="preserve">13.63</w:t>
@@ -1086,8 +1080,8 @@
                 <w:b w:val="false"/>
                 <w:u w:val="none"/>
                 <w:strike w:val="false"/>
-                <w:sz w:val="18"/>
-                <w:szCs w:val="18"/>
+                <w:sz w:val="22"/>
+                <w:szCs w:val="22"/>
                 <w:color w:val="000000"/>
               </w:rPr>
               <w:br/>
@@ -1099,8 +1093,8 @@
                 <w:b w:val="false"/>
                 <w:u w:val="none"/>
                 <w:strike w:val="false"/>
-                <w:sz w:val="18"/>
-                <w:szCs w:val="18"/>
+                <w:sz w:val="22"/>
+                <w:szCs w:val="22"/>
                 <w:color w:val="000000"/>
               </w:rPr>
               <w:t xml:space="preserve">(4.43)</w:t>
@@ -1142,8 +1136,8 @@
                 <w:b w:val="false"/>
                 <w:u w:val="none"/>
                 <w:strike w:val="false"/>
-                <w:sz w:val="18"/>
-                <w:szCs w:val="18"/>
+                <w:sz w:val="22"/>
+                <w:szCs w:val="22"/>
                 <w:color w:val="000000"/>
               </w:rPr>
             </w:pPr>
@@ -1154,8 +1148,8 @@
                 <w:b w:val="false"/>
                 <w:u w:val="none"/>
                 <w:strike w:val="false"/>
-                <w:sz w:val="18"/>
-                <w:szCs w:val="18"/>
+                <w:sz w:val="22"/>
+                <w:szCs w:val="22"/>
                 <w:color w:val="000000"/>
               </w:rPr>
               <w:t xml:space="preserve">23.49</w:t>
@@ -1167,8 +1161,8 @@
                 <w:b w:val="false"/>
                 <w:u w:val="none"/>
                 <w:strike w:val="false"/>
-                <w:sz w:val="18"/>
-                <w:szCs w:val="18"/>
+                <w:sz w:val="22"/>
+                <w:szCs w:val="22"/>
                 <w:color w:val="000000"/>
               </w:rPr>
               <w:br/>
@@ -1180,8 +1174,8 @@
                 <w:b w:val="false"/>
                 <w:u w:val="none"/>
                 <w:strike w:val="false"/>
-                <w:sz w:val="18"/>
-                <w:szCs w:val="18"/>
+                <w:sz w:val="22"/>
+                <w:szCs w:val="22"/>
                 <w:color w:val="000000"/>
               </w:rPr>
               <w:t xml:space="preserve">(9.45)</w:t>
@@ -1223,8 +1217,8 @@
                 <w:b w:val="false"/>
                 <w:u w:val="none"/>
                 <w:strike w:val="false"/>
-                <w:sz w:val="18"/>
-                <w:szCs w:val="18"/>
+                <w:sz w:val="22"/>
+                <w:szCs w:val="22"/>
                 <w:color w:val="000000"/>
               </w:rPr>
             </w:pPr>
@@ -1235,8 +1229,8 @@
                 <w:b w:val="false"/>
                 <w:u w:val="none"/>
                 <w:strike w:val="false"/>
-                <w:sz w:val="18"/>
-                <w:szCs w:val="18"/>
+                <w:sz w:val="22"/>
+                <w:szCs w:val="22"/>
                 <w:color w:val="000000"/>
               </w:rPr>
               <w:t xml:space="preserve">17.90</w:t>
@@ -1248,8 +1242,8 @@
                 <w:b w:val="false"/>
                 <w:u w:val="none"/>
                 <w:strike w:val="false"/>
-                <w:sz w:val="18"/>
-                <w:szCs w:val="18"/>
+                <w:sz w:val="22"/>
+                <w:szCs w:val="22"/>
                 <w:color w:val="000000"/>
               </w:rPr>
               <w:br/>
@@ -1261,8 +1255,8 @@
                 <w:b w:val="false"/>
                 <w:u w:val="none"/>
                 <w:strike w:val="false"/>
-                <w:sz w:val="18"/>
-                <w:szCs w:val="18"/>
+                <w:sz w:val="22"/>
+                <w:szCs w:val="22"/>
                 <w:color w:val="000000"/>
               </w:rPr>
               <w:t xml:space="preserve">(5.28)</w:t>
@@ -1304,8 +1298,8 @@
                 <w:b w:val="false"/>
                 <w:u w:val="none"/>
                 <w:strike w:val="false"/>
-                <w:sz w:val="18"/>
-                <w:szCs w:val="18"/>
+                <w:sz w:val="22"/>
+                <w:szCs w:val="22"/>
                 <w:color w:val="000000"/>
               </w:rPr>
             </w:pPr>
@@ -1316,8 +1310,8 @@
                 <w:b w:val="false"/>
                 <w:u w:val="none"/>
                 <w:strike w:val="false"/>
-                <w:sz w:val="18"/>
-                <w:szCs w:val="18"/>
+                <w:sz w:val="22"/>
+                <w:szCs w:val="22"/>
                 <w:color w:val="000000"/>
               </w:rPr>
               <w:t xml:space="preserve">12.51</w:t>
@@ -1329,8 +1323,8 @@
                 <w:b w:val="false"/>
                 <w:u w:val="none"/>
                 <w:strike w:val="false"/>
-                <w:sz w:val="18"/>
-                <w:szCs w:val="18"/>
+                <w:sz w:val="22"/>
+                <w:szCs w:val="22"/>
                 <w:color w:val="000000"/>
               </w:rPr>
               <w:br/>
@@ -1342,8 +1336,8 @@
                 <w:b w:val="false"/>
                 <w:u w:val="none"/>
                 <w:strike w:val="false"/>
-                <w:sz w:val="18"/>
-                <w:szCs w:val="18"/>
+                <w:sz w:val="22"/>
+                <w:szCs w:val="22"/>
                 <w:color w:val="000000"/>
               </w:rPr>
               <w:t xml:space="preserve">(4.33)</w:t>
@@ -1353,7 +1347,6 @@
       </w:tr>
       <w:tr>
         <w:trPr>
-          <w:cantSplit/>
           <w:trHeight w:val="360" w:hRule="auto"/>
         </w:trPr>
         <w:tc>
@@ -1391,8 +1384,8 @@
                 <w:b w:val="true"/>
                 <w:u w:val="none"/>
                 <w:strike w:val="false"/>
-                <w:sz w:val="18"/>
-                <w:szCs w:val="18"/>
+                <w:sz w:val="22"/>
+                <w:szCs w:val="22"/>
                 <w:color w:val="000000"/>
               </w:rPr>
             </w:pPr>
@@ -1403,8 +1396,8 @@
                 <w:b w:val="true"/>
                 <w:u w:val="none"/>
                 <w:strike w:val="false"/>
-                <w:sz w:val="18"/>
-                <w:szCs w:val="18"/>
+                <w:sz w:val="22"/>
+                <w:szCs w:val="22"/>
                 <w:color w:val="000000"/>
               </w:rPr>
               <w:t xml:space="preserve">Tool calls</w:t>
@@ -1446,8 +1439,8 @@
                 <w:b w:val="false"/>
                 <w:u w:val="none"/>
                 <w:strike w:val="false"/>
-                <w:sz w:val="18"/>
-                <w:szCs w:val="18"/>
+                <w:sz w:val="22"/>
+                <w:szCs w:val="22"/>
                 <w:color w:val="000000"/>
               </w:rPr>
             </w:pPr>
@@ -1458,8 +1451,8 @@
                 <w:b w:val="false"/>
                 <w:u w:val="none"/>
                 <w:strike w:val="false"/>
-                <w:sz w:val="18"/>
-                <w:szCs w:val="18"/>
+                <w:sz w:val="22"/>
+                <w:szCs w:val="22"/>
                 <w:color w:val="000000"/>
               </w:rPr>
               <w:t xml:space="preserve">3.21</w:t>
@@ -1471,8 +1464,8 @@
                 <w:b w:val="false"/>
                 <w:u w:val="none"/>
                 <w:strike w:val="false"/>
-                <w:sz w:val="18"/>
-                <w:szCs w:val="18"/>
+                <w:sz w:val="22"/>
+                <w:szCs w:val="22"/>
                 <w:color w:val="000000"/>
               </w:rPr>
               <w:br/>
@@ -1484,8 +1477,8 @@
                 <w:b w:val="false"/>
                 <w:u w:val="none"/>
                 <w:strike w:val="false"/>
-                <w:sz w:val="18"/>
-                <w:szCs w:val="18"/>
+                <w:sz w:val="22"/>
+                <w:szCs w:val="22"/>
                 <w:color w:val="000000"/>
               </w:rPr>
               <w:t xml:space="preserve">(1.61)</w:t>
@@ -1527,8 +1520,8 @@
                 <w:b w:val="false"/>
                 <w:u w:val="none"/>
                 <w:strike w:val="false"/>
-                <w:sz w:val="18"/>
-                <w:szCs w:val="18"/>
+                <w:sz w:val="22"/>
+                <w:szCs w:val="22"/>
                 <w:color w:val="000000"/>
               </w:rPr>
             </w:pPr>
@@ -1539,8 +1532,8 @@
                 <w:b w:val="false"/>
                 <w:u w:val="none"/>
                 <w:strike w:val="false"/>
-                <w:sz w:val="18"/>
-                <w:szCs w:val="18"/>
+                <w:sz w:val="22"/>
+                <w:szCs w:val="22"/>
                 <w:color w:val="000000"/>
               </w:rPr>
               <w:t xml:space="preserve">7.53</w:t>
@@ -1552,8 +1545,8 @@
                 <w:b w:val="false"/>
                 <w:u w:val="none"/>
                 <w:strike w:val="false"/>
-                <w:sz w:val="18"/>
-                <w:szCs w:val="18"/>
+                <w:sz w:val="22"/>
+                <w:szCs w:val="22"/>
                 <w:color w:val="000000"/>
               </w:rPr>
               <w:br/>
@@ -1565,8 +1558,8 @@
                 <w:b w:val="false"/>
                 <w:u w:val="none"/>
                 <w:strike w:val="false"/>
-                <w:sz w:val="18"/>
-                <w:szCs w:val="18"/>
+                <w:sz w:val="22"/>
+                <w:szCs w:val="22"/>
                 <w:color w:val="000000"/>
               </w:rPr>
               <w:t xml:space="preserve">(3.42)</w:t>
@@ -1608,8 +1601,8 @@
                 <w:b w:val="false"/>
                 <w:u w:val="none"/>
                 <w:strike w:val="false"/>
-                <w:sz w:val="18"/>
-                <w:szCs w:val="18"/>
+                <w:sz w:val="22"/>
+                <w:szCs w:val="22"/>
                 <w:color w:val="000000"/>
               </w:rPr>
             </w:pPr>
@@ -1620,8 +1613,8 @@
                 <w:b w:val="false"/>
                 <w:u w:val="none"/>
                 <w:strike w:val="false"/>
-                <w:sz w:val="18"/>
-                <w:szCs w:val="18"/>
+                <w:sz w:val="22"/>
+                <w:szCs w:val="22"/>
                 <w:color w:val="000000"/>
               </w:rPr>
               <w:t xml:space="preserve">5.26</w:t>
@@ -1633,8 +1626,8 @@
                 <w:b w:val="false"/>
                 <w:u w:val="none"/>
                 <w:strike w:val="false"/>
-                <w:sz w:val="18"/>
-                <w:szCs w:val="18"/>
+                <w:sz w:val="22"/>
+                <w:szCs w:val="22"/>
                 <w:color w:val="000000"/>
               </w:rPr>
               <w:br/>
@@ -1646,8 +1639,8 @@
                 <w:b w:val="false"/>
                 <w:u w:val="none"/>
                 <w:strike w:val="false"/>
-                <w:sz w:val="18"/>
-                <w:szCs w:val="18"/>
+                <w:sz w:val="22"/>
+                <w:szCs w:val="22"/>
                 <w:color w:val="000000"/>
               </w:rPr>
               <w:t xml:space="preserve">(1.97)</w:t>
@@ -1689,8 +1682,8 @@
                 <w:b w:val="false"/>
                 <w:u w:val="none"/>
                 <w:strike w:val="false"/>
-                <w:sz w:val="18"/>
-                <w:szCs w:val="18"/>
+                <w:sz w:val="22"/>
+                <w:szCs w:val="22"/>
                 <w:color w:val="000000"/>
               </w:rPr>
             </w:pPr>
@@ -1701,8 +1694,8 @@
                 <w:b w:val="false"/>
                 <w:u w:val="none"/>
                 <w:strike w:val="false"/>
-                <w:sz w:val="18"/>
-                <w:szCs w:val="18"/>
+                <w:sz w:val="22"/>
+                <w:szCs w:val="22"/>
                 <w:color w:val="000000"/>
               </w:rPr>
               <w:t xml:space="preserve">2.71</w:t>
@@ -1714,8 +1707,8 @@
                 <w:b w:val="false"/>
                 <w:u w:val="none"/>
                 <w:strike w:val="false"/>
-                <w:sz w:val="18"/>
-                <w:szCs w:val="18"/>
+                <w:sz w:val="22"/>
+                <w:szCs w:val="22"/>
                 <w:color w:val="000000"/>
               </w:rPr>
               <w:br/>
@@ -1727,8 +1720,8 @@
                 <w:b w:val="false"/>
                 <w:u w:val="none"/>
                 <w:strike w:val="false"/>
-                <w:sz w:val="18"/>
-                <w:szCs w:val="18"/>
+                <w:sz w:val="22"/>
+                <w:szCs w:val="22"/>
                 <w:color w:val="000000"/>
               </w:rPr>
               <w:t xml:space="preserve">(1.83)</w:t>
@@ -1738,7 +1731,6 @@
       </w:tr>
       <w:tr>
         <w:trPr>
-          <w:cantSplit/>
           <w:trHeight w:val="360" w:hRule="auto"/>
         </w:trPr>
         <w:tc>
@@ -1776,8 +1768,8 @@
                 <w:b w:val="true"/>
                 <w:u w:val="none"/>
                 <w:strike w:val="false"/>
-                <w:sz w:val="18"/>
-                <w:szCs w:val="18"/>
+                <w:sz w:val="22"/>
+                <w:szCs w:val="22"/>
                 <w:color w:val="000000"/>
               </w:rPr>
             </w:pPr>
@@ -1788,8 +1780,8 @@
                 <w:b w:val="true"/>
                 <w:u w:val="none"/>
                 <w:strike w:val="false"/>
-                <w:sz w:val="18"/>
-                <w:szCs w:val="18"/>
+                <w:sz w:val="22"/>
+                <w:szCs w:val="22"/>
                 <w:color w:val="000000"/>
               </w:rPr>
               <w:t xml:space="preserve">Runtime (seconds)</w:t>
@@ -1831,8 +1823,8 @@
                 <w:b w:val="false"/>
                 <w:u w:val="none"/>
                 <w:strike w:val="false"/>
-                <w:sz w:val="18"/>
-                <w:szCs w:val="18"/>
+                <w:sz w:val="22"/>
+                <w:szCs w:val="22"/>
                 <w:color w:val="000000"/>
               </w:rPr>
             </w:pPr>
@@ -1843,8 +1835,8 @@
                 <w:b w:val="false"/>
                 <w:u w:val="none"/>
                 <w:strike w:val="false"/>
-                <w:sz w:val="18"/>
-                <w:szCs w:val="18"/>
+                <w:sz w:val="22"/>
+                <w:szCs w:val="22"/>
                 <w:color w:val="000000"/>
               </w:rPr>
               <w:t xml:space="preserve">56.40</w:t>
@@ -1856,8 +1848,8 @@
                 <w:b w:val="false"/>
                 <w:u w:val="none"/>
                 <w:strike w:val="false"/>
-                <w:sz w:val="18"/>
-                <w:szCs w:val="18"/>
+                <w:sz w:val="22"/>
+                <w:szCs w:val="22"/>
                 <w:color w:val="000000"/>
               </w:rPr>
               <w:br/>
@@ -1869,8 +1861,8 @@
                 <w:b w:val="false"/>
                 <w:u w:val="none"/>
                 <w:strike w:val="false"/>
-                <w:sz w:val="18"/>
-                <w:szCs w:val="18"/>
+                <w:sz w:val="22"/>
+                <w:szCs w:val="22"/>
                 <w:color w:val="000000"/>
               </w:rPr>
               <w:t xml:space="preserve">(21.69)</w:t>
@@ -1912,8 +1904,8 @@
                 <w:b w:val="false"/>
                 <w:u w:val="none"/>
                 <w:strike w:val="false"/>
-                <w:sz w:val="18"/>
-                <w:szCs w:val="18"/>
+                <w:sz w:val="22"/>
+                <w:szCs w:val="22"/>
                 <w:color w:val="000000"/>
               </w:rPr>
             </w:pPr>
@@ -1924,8 +1916,8 @@
                 <w:b w:val="false"/>
                 <w:u w:val="none"/>
                 <w:strike w:val="false"/>
-                <w:sz w:val="18"/>
-                <w:szCs w:val="18"/>
+                <w:sz w:val="22"/>
+                <w:szCs w:val="22"/>
                 <w:color w:val="000000"/>
               </w:rPr>
               <w:t xml:space="preserve">449.40</w:t>
@@ -1937,8 +1929,8 @@
                 <w:b w:val="false"/>
                 <w:u w:val="none"/>
                 <w:strike w:val="false"/>
-                <w:sz w:val="18"/>
-                <w:szCs w:val="18"/>
+                <w:sz w:val="22"/>
+                <w:szCs w:val="22"/>
                 <w:color w:val="000000"/>
               </w:rPr>
               <w:br/>
@@ -1950,8 +1942,8 @@
                 <w:b w:val="false"/>
                 <w:u w:val="none"/>
                 <w:strike w:val="false"/>
-                <w:sz w:val="18"/>
-                <w:szCs w:val="18"/>
+                <w:sz w:val="22"/>
+                <w:szCs w:val="22"/>
                 <w:color w:val="000000"/>
               </w:rPr>
               <w:t xml:space="preserve">(180.36)</w:t>
@@ -1993,8 +1985,8 @@
                 <w:b w:val="false"/>
                 <w:u w:val="none"/>
                 <w:strike w:val="false"/>
-                <w:sz w:val="18"/>
-                <w:szCs w:val="18"/>
+                <w:sz w:val="22"/>
+                <w:szCs w:val="22"/>
                 <w:color w:val="000000"/>
               </w:rPr>
             </w:pPr>
@@ -2005,8 +1997,8 @@
                 <w:b w:val="false"/>
                 <w:u w:val="none"/>
                 <w:strike w:val="false"/>
-                <w:sz w:val="18"/>
-                <w:szCs w:val="18"/>
+                <w:sz w:val="22"/>
+                <w:szCs w:val="22"/>
                 <w:color w:val="000000"/>
               </w:rPr>
               <w:t xml:space="preserve">426.30</w:t>
@@ -2018,8 +2010,8 @@
                 <w:b w:val="false"/>
                 <w:u w:val="none"/>
                 <w:strike w:val="false"/>
-                <w:sz w:val="18"/>
-                <w:szCs w:val="18"/>
+                <w:sz w:val="22"/>
+                <w:szCs w:val="22"/>
                 <w:color w:val="000000"/>
               </w:rPr>
               <w:br/>
@@ -2031,8 +2023,8 @@
                 <w:b w:val="false"/>
                 <w:u w:val="none"/>
                 <w:strike w:val="false"/>
-                <w:sz w:val="18"/>
-                <w:szCs w:val="18"/>
+                <w:sz w:val="22"/>
+                <w:szCs w:val="22"/>
                 <w:color w:val="000000"/>
               </w:rPr>
               <w:t xml:space="preserve">(205.70)</w:t>
@@ -2074,8 +2066,8 @@
                 <w:b w:val="false"/>
                 <w:u w:val="none"/>
                 <w:strike w:val="false"/>
-                <w:sz w:val="18"/>
-                <w:szCs w:val="18"/>
+                <w:sz w:val="22"/>
+                <w:szCs w:val="22"/>
                 <w:color w:val="000000"/>
               </w:rPr>
             </w:pPr>
@@ -2086,8 +2078,8 @@
                 <w:b w:val="false"/>
                 <w:u w:val="none"/>
                 <w:strike w:val="false"/>
-                <w:sz w:val="18"/>
-                <w:szCs w:val="18"/>
+                <w:sz w:val="22"/>
+                <w:szCs w:val="22"/>
                 <w:color w:val="000000"/>
               </w:rPr>
               <w:t xml:space="preserve">438.53</w:t>
@@ -2099,8 +2091,8 @@
                 <w:b w:val="false"/>
                 <w:u w:val="none"/>
                 <w:strike w:val="false"/>
-                <w:sz w:val="18"/>
-                <w:szCs w:val="18"/>
+                <w:sz w:val="22"/>
+                <w:szCs w:val="22"/>
                 <w:color w:val="000000"/>
               </w:rPr>
               <w:br/>
@@ -2112,8 +2104,8 @@
                 <w:b w:val="false"/>
                 <w:u w:val="none"/>
                 <w:strike w:val="false"/>
-                <w:sz w:val="18"/>
-                <w:szCs w:val="18"/>
+                <w:sz w:val="22"/>
+                <w:szCs w:val="22"/>
                 <w:color w:val="000000"/>
               </w:rPr>
               <w:t xml:space="preserve">(241.04)</w:t>
@@ -2123,7 +2115,6 @@
       </w:tr>
       <w:tr>
         <w:trPr>
-          <w:cantSplit/>
           <w:trHeight w:val="360" w:hRule="auto"/>
         </w:trPr>
         <w:tc>
@@ -2161,8 +2152,8 @@
                 <w:b w:val="true"/>
                 <w:u w:val="none"/>
                 <w:strike w:val="false"/>
-                <w:sz w:val="18"/>
-                <w:szCs w:val="18"/>
+                <w:sz w:val="22"/>
+                <w:szCs w:val="22"/>
                 <w:color w:val="000000"/>
               </w:rPr>
             </w:pPr>
@@ -2173,8 +2164,8 @@
                 <w:b w:val="true"/>
                 <w:u w:val="none"/>
                 <w:strike w:val="false"/>
-                <w:sz w:val="18"/>
-                <w:szCs w:val="18"/>
+                <w:sz w:val="22"/>
+                <w:szCs w:val="22"/>
                 <w:color w:val="000000"/>
               </w:rPr>
               <w:t xml:space="preserve">Observations</w:t>
@@ -2216,8 +2207,8 @@
                 <w:b w:val="false"/>
                 <w:u w:val="none"/>
                 <w:strike w:val="false"/>
-                <w:sz w:val="18"/>
-                <w:szCs w:val="18"/>
+                <w:sz w:val="22"/>
+                <w:szCs w:val="22"/>
                 <w:color w:val="000000"/>
               </w:rPr>
             </w:pPr>
@@ -2228,8 +2219,8 @@
                 <w:b w:val="false"/>
                 <w:u w:val="none"/>
                 <w:strike w:val="false"/>
-                <w:sz w:val="18"/>
-                <w:szCs w:val="18"/>
+                <w:sz w:val="22"/>
+                <w:szCs w:val="22"/>
                 <w:color w:val="000000"/>
               </w:rPr>
               <w:t xml:space="preserve">200</w:t>
@@ -2271,8 +2262,8 @@
                 <w:b w:val="false"/>
                 <w:u w:val="none"/>
                 <w:strike w:val="false"/>
-                <w:sz w:val="18"/>
-                <w:szCs w:val="18"/>
+                <w:sz w:val="22"/>
+                <w:szCs w:val="22"/>
                 <w:color w:val="000000"/>
               </w:rPr>
             </w:pPr>
@@ -2283,8 +2274,8 @@
                 <w:b w:val="false"/>
                 <w:u w:val="none"/>
                 <w:strike w:val="false"/>
-                <w:sz w:val="18"/>
-                <w:szCs w:val="18"/>
+                <w:sz w:val="22"/>
+                <w:szCs w:val="22"/>
                 <w:color w:val="000000"/>
               </w:rPr>
               <w:t xml:space="preserve">200</w:t>
@@ -2326,8 +2317,8 @@
                 <w:b w:val="false"/>
                 <w:u w:val="none"/>
                 <w:strike w:val="false"/>
-                <w:sz w:val="18"/>
-                <w:szCs w:val="18"/>
+                <w:sz w:val="22"/>
+                <w:szCs w:val="22"/>
                 <w:color w:val="000000"/>
               </w:rPr>
             </w:pPr>
@@ -2338,8 +2329,8 @@
                 <w:b w:val="false"/>
                 <w:u w:val="none"/>
                 <w:strike w:val="false"/>
-                <w:sz w:val="18"/>
-                <w:szCs w:val="18"/>
+                <w:sz w:val="22"/>
+                <w:szCs w:val="22"/>
                 <w:color w:val="000000"/>
               </w:rPr>
               <w:t xml:space="preserve">200</w:t>
@@ -2381,8 +2372,8 @@
                 <w:b w:val="false"/>
                 <w:u w:val="none"/>
                 <w:strike w:val="false"/>
-                <w:sz w:val="18"/>
-                <w:szCs w:val="18"/>
+                <w:sz w:val="22"/>
+                <w:szCs w:val="22"/>
                 <w:color w:val="000000"/>
               </w:rPr>
             </w:pPr>
@@ -2393,8 +2384,8 @@
                 <w:b w:val="false"/>
                 <w:u w:val="none"/>
                 <w:strike w:val="false"/>
-                <w:sz w:val="18"/>
-                <w:szCs w:val="18"/>
+                <w:sz w:val="22"/>
+                <w:szCs w:val="22"/>
                 <w:color w:val="000000"/>
               </w:rPr>
               <w:t xml:space="preserve">200</w:t>
@@ -2404,7 +2395,6 @@
       </w:tr>
       <w:tr>
         <w:trPr>
-          <w:cantSplit/>
           <w:trHeight w:val="360" w:hRule="auto"/>
         </w:trPr>
         <w:tc>
@@ -2443,8 +2433,8 @@
                 <w:b w:val="false"/>
                 <w:u w:val="none"/>
                 <w:strike w:val="false"/>
-                <w:sz w:val="16"/>
-                <w:szCs w:val="16"/>
+                <w:sz w:val="20"/>
+                <w:szCs w:val="20"/>
                 <w:color w:val="000000"/>
               </w:rPr>
             </w:pPr>
@@ -2455,8 +2445,8 @@
                 <w:b w:val="false"/>
                 <w:u w:val="none"/>
                 <w:strike w:val="false"/>
-                <w:sz w:val="16"/>
-                <w:szCs w:val="16"/>
+                <w:sz w:val="20"/>
+                <w:szCs w:val="20"/>
                 <w:color w:val="000000"/>
               </w:rPr>
               <w:t xml:space="preserve">Note: Cells report means with standard deviations in parentheses.</w:t>
@@ -2466,8 +2456,8 @@
       </w:tr>
     </w:tbl>
     <w:sectPr>
-      <w:pgMar w:header="288" w:bottom="504" w:top="504" w:right="288" w:left="288" w:footer="288" w:gutter="0"/>
-      <w:pgSz w:h="16834" w:w="11909" w:orient="portrait"/>
+      <w:pgMar w:header="850" w:bottom="1134" w:top="1701" w:right="1417" w:left="1417" w:footer="709" w:gutter="0"/>
+      <w:pgSz w:h="16838" w:w="11906" w:orient="portrait"/>
       <w:type w:val="continuous"/>
       <w:cols/>
     </w:sectPr>

</xml_diff>